<commit_message>
docs: update presentation script slide numbers
</commit_message>
<xml_diff>
--- a/docs/presentation_script_final.docx
+++ b/docs/presentation_script_final.docx
@@ -29,7 +29,7 @@
         <w:pStyle w:val="Heading2"/>
       </w:pPr>
       <w:r>
-        <w:t>1. Salma (Slides 0 - 2) - The Hook</w:t>
+        <w:t>1. Salma (Slides 1 - 2) - The Hook</w:t>
       </w:r>
     </w:p>
     <w:p>
@@ -186,7 +186,7 @@
         <w:pStyle w:val="Heading2"/>
       </w:pPr>
       <w:r>
-        <w:t>8. Essam (Slide 13) - Competitors &amp; Go-To-Market</w:t>
+        <w:t>8. Essam (Slides 13 - 15) - Community, Business &amp; Competitors</w:t>
       </w:r>
     </w:p>
     <w:p>
@@ -205,7 +205,7 @@
         <w:pStyle w:val="Heading2"/>
       </w:pPr>
       <w:r>
-        <w:t>9. Abdelrahman (Slide 13.5) - Financials (LTV vs CAC)</w:t>
+        <w:t>9. Abdelrahman (Slide 16) - Financial Viability</w:t>
       </w:r>
     </w:p>
     <w:p>
@@ -224,7 +224,7 @@
         <w:pStyle w:val="Heading2"/>
       </w:pPr>
       <w:r>
-        <w:t>10. Salma (Slides 13.8 - 14) - The Architecture Team &amp; Close</w:t>
+        <w:t>10. Salma (Slide 17) - The Architecture Team &amp; Close</w:t>
       </w:r>
     </w:p>
     <w:p>

</xml_diff>